<commit_message>
viva_prep: add Q&A on 'if you slide SNR what is the AI doing?'
Adds a warm-up Q&A entry that addresses a likely viva confusion:
that the demo sliders make it look like the user is doing the work.
The answer reframes: SNR and kappa are scenario inputs (hardware
setting + feedback-channel property), and the AI's only job is to
pick rho, the power split, on each channel.  Walks through what
actually happens behind a slider drag (600 fresh channels, one
forward pass per channel, average displayed) and uses a thermostat
analogy to make the input-vs-decision distinction stick.
</commit_message>
<xml_diff>
--- a/report/viva_prep.docx
+++ b/report/viva_prep.docx
@@ -6555,6 +6555,42 @@
       </w:r>
     </w:p>
     <w:p>
+      <w:r>
+        <w:rPr>
+          <w:b/>
+          <w:color w:val="1F4E79"/>
+          <w:sz w:val="22"/>
+        </w:rPr>
+        <w:t xml:space="preserve">Q.  </w:t>
+      </w:r>
+      <w:r>
+        <w:rPr>
+          <w:b/>
+          <w:sz w:val="22"/>
+        </w:rPr>
+        <w:t>If you have to manually change the SNR in the demo, what is the AI actually doing in this system?</w:t>
+      </w:r>
+    </w:p>
+    <w:p>
+      <w:pPr>
+        <w:spacing w:after="200"/>
+      </w:pPr>
+      <w:r>
+        <w:rPr>
+          <w:b/>
+          <w:color w:val="2CA02C"/>
+          <w:sz w:val="22"/>
+        </w:rPr>
+        <w:t xml:space="preserve">A.  </w:t>
+      </w:r>
+      <w:r>
+        <w:rPr>
+          <w:sz w:val="22"/>
+        </w:rPr>
+        <w:t>The sliders set the SCENARIO; the AI picks the ACTION.  SNR is a hardware setting (how loud Alice transmits), and κ is a property of Alice's feedback channel (how good her intel on Eve is).  Alice doesn't decide either of those — they're inputs to the problem.  The AI's only job is to pick ρ, the power split between message and AN, from 17 discrete values.  When we drag a slider in the demo, behind the scenes the app generates 600 fresh random channels and for EACH channel the AI takes a 7-number state vector (which embeds the current SNR, κ, channel magnitudes, alignment), runs one forward pass through the Q-network, and outputs a ρ.  The displayed bars are averages over those 600 channel-by-channel decisions.  Sliding the slider doesn't replace the AI; it just asks the AI a different question 600 times in a row.  Think of a thermostat — the outside temperature is set by the weather, the desired temperature by the user, and the thermostat decides the heating rate given those two inputs.  Same idea.</w:t>
+      </w:r>
+    </w:p>
+    <w:p>
       <w:pPr>
         <w:pStyle w:val="Heading2"/>
       </w:pPr>

</xml_diff>